<commit_message>
Correct the route-summarisation figures: 10 -> 6 routes (40 %), not 8 -> 2
Each branch router advertises five prefixes into its area: three LANs, the serial
/30 and its loopback /32. The area range covers only the LANs; the /30 and /32 are
numbered from 172.16.255.0/24, outside the branch /22, so they are still
advertised one by one. The backbone therefore goes from 10 branch routes to 6,
not from 8 to 2. Also: 20 internal prefixes (13 user + 7 infrastructure), not 16,
and the conclusion no longer says the controls were verified, since the design
has not been built yet. Updated the docs, diagram, README, report and PDF.
</commit_message>
<xml_diff>
--- a/TechNova-Network-Design-Report.docx
+++ b/TechNova-Network-Design-Report.docx
@@ -201,10 +201,7 @@
         <w:jc w:val="both"/>
       </w:pPr>
       <w:r>
-        <w:t>This project designs and documents a complete enterprise network</w:t>
-      </w:r>
-      <w:r>
-        <w:t xml:space="preserve"> for a three-site company of 320 users. From a single </w:t>
+        <w:t xml:space="preserve">This project designs and documents a complete enterprise network for a three-site company of 320 users. From a single </w:t>
       </w:r>
       <w:r>
         <w:rPr>
@@ -216,13 +213,13 @@
         <w:t>172.16.0.0/16</w:t>
       </w:r>
       <w:r>
-        <w:t xml:space="preserve"> address block, variable-length subnet masking produces thirteen user subnetworks and seven infrastructure prefixes (three point-to-point links and four loopbacks), allocated so that each site occupies one contiguous prefix. Layer-2 segmentation uses 802.1Q VLANs with pruned trunks, an LACP EtherChannel between the core and each access switch, and Rapid-PVST+ with the multilayer switch as root. Layer-3 forwarding uses OSPFv2 in three areas, with the headquarters border router acting as area border router an</w:t>
-      </w:r>
-      <w:r>
-        <w:t>d autonomous system boundary router; area ranges reduce the branch routes carried into the backbone from eight to two. Internet access for all 320 users is provided through port address translation onto a single public address, with one static translation publishing the web server. Twelve named security controls are applied, each mapped to the specific threat it answers. The design comes with a step-by-step Cisco Packet Tracer build guide and a 60-case test plan covering</w:t>
-      </w:r>
-      <w:r>
-        <w:t xml:space="preserve"> Layer 2, DHCP, routing, end-to-end reachability, translation and security enforcement. The report closes with an explicit statement of what the design does </w:t>
+        <w:t xml:space="preserve"> address block, variable-length subnet masking produces thirteen user subnetworks and seven infrastructure prefixes (three point-to-point links and four loopbacks), allocated so that each site occupies one contiguous prefix. Layer-2 segmentation uses 802.1Q VLANs with pruned trunks, an LACP EtherChannel between the core and each access switch, and Rapid-PVST+ with the multilayer switch as root. Layer-3 forwarding uses OSPFv2 in three areas, with the headquarters border router acting as area border router and autonomous system boundary router; </w:t>
+      </w:r>
+      <w:r>
+        <w:t>area ranges collapse each branch's LANs into one route, reducing the branch routes carried into the backbone from ten to six.</w:t>
+      </w:r>
+      <w:r>
+        <w:t xml:space="preserve"> Internet access for all 320 users is provided through port address translation onto a single public address, with one static translation publishing the web server. Twelve named security controls are applied, each mapped to the specific threat it answers. The design comes with a step-by-step Cisco Packet Tracer build guide and a 60-case test plan covering Layer 2, DHCP, routing, end-to-end reachability, translation and security enforcement. The report closes with an explicit statement of what the design does </w:t>
       </w:r>
       <w:r>
         <w:rPr>
@@ -2811,7 +2808,6 @@
           <w:sz w:val="30"/>
           <w:szCs w:val="30"/>
         </w:rPr>
-        <w:lastRenderedPageBreak/>
         <w:t>1. Introduction</w:t>
       </w:r>
       <w:bookmarkEnd w:id="2"/>
@@ -3045,10 +3041,7 @@
         <w:jc w:val="both"/>
       </w:pPr>
       <w:r>
-        <w:t>The build guide and test plan target Cisco Packet Tracer 8.x, which</w:t>
-      </w:r>
-      <w:r>
-        <w:t xml:space="preserve"> models IOS configuration and control-plane behaviour faithfully enough for design validation, with the limitations noted in §9.1.</w:t>
+        <w:t>The build guide and test plan target Cisco Packet Tracer 8.x, which models IOS configuration and control-plane behaviour faithfully enough for design validation, with the limitations noted in §9.1.</w:t>
       </w:r>
     </w:p>
     <w:p>
@@ -3073,7 +3066,6 @@
           <w:sz w:val="30"/>
           <w:szCs w:val="30"/>
         </w:rPr>
-        <w:lastRenderedPageBreak/>
         <w:t>2. Requirements analysis</w:t>
       </w:r>
       <w:bookmarkEnd w:id="7"/>
@@ -3121,12 +3113,6 @@
         <w:gridCol w:w="4513"/>
       </w:tblGrid>
       <w:tr>
-        <w:tblPrEx>
-          <w:tblCellMar>
-            <w:top w:w="0" w:type="dxa"/>
-            <w:bottom w:w="0" w:type="dxa"/>
-          </w:tblCellMar>
-        </w:tblPrEx>
         <w:trPr>
           <w:tblHeader/>
         </w:trPr>
@@ -3188,12 +3174,6 @@
         </w:tc>
       </w:tr>
       <w:tr>
-        <w:tblPrEx>
-          <w:tblCellMar>
-            <w:top w:w="0" w:type="dxa"/>
-            <w:bottom w:w="0" w:type="dxa"/>
-          </w:tblCellMar>
-        </w:tblPrEx>
         <w:tc>
           <w:tcPr>
             <w:tcW w:w="4513" w:type="dxa"/>
@@ -3254,12 +3234,6 @@
         </w:tc>
       </w:tr>
       <w:tr>
-        <w:tblPrEx>
-          <w:tblCellMar>
-            <w:top w:w="0" w:type="dxa"/>
-            <w:bottom w:w="0" w:type="dxa"/>
-          </w:tblCellMar>
-        </w:tblPrEx>
         <w:tc>
           <w:tcPr>
             <w:tcW w:w="4513" w:type="dxa"/>
@@ -3340,12 +3314,6 @@
         </w:tc>
       </w:tr>
       <w:tr>
-        <w:tblPrEx>
-          <w:tblCellMar>
-            <w:top w:w="0" w:type="dxa"/>
-            <w:bottom w:w="0" w:type="dxa"/>
-          </w:tblCellMar>
-        </w:tblPrEx>
         <w:tc>
           <w:tcPr>
             <w:tcW w:w="4513" w:type="dxa"/>
@@ -3424,12 +3392,6 @@
         </w:tc>
       </w:tr>
       <w:tr>
-        <w:tblPrEx>
-          <w:tblCellMar>
-            <w:top w:w="0" w:type="dxa"/>
-            <w:bottom w:w="0" w:type="dxa"/>
-          </w:tblCellMar>
-        </w:tblPrEx>
         <w:tc>
           <w:tcPr>
             <w:tcW w:w="4513" w:type="dxa"/>
@@ -3528,7 +3490,6 @@
           <w:sz w:val="30"/>
           <w:szCs w:val="30"/>
         </w:rPr>
-        <w:lastRenderedPageBreak/>
         <w:t>3. Network design</w:t>
       </w:r>
       <w:bookmarkEnd w:id="8"/>
@@ -3671,10 +3632,7 @@
         <w:jc w:val="both"/>
       </w:pPr>
       <w:r>
-        <w:t>A partial mesh (adding BR1↔BR2) was evaluated and rejected on two grounds. First, cost: a third circuit to carry branch-to-branch traffic measured in kilobits. Second, and more interesting technically, such a link would join two non-backbone areas directly. OSPF requires every area to touch area 0; a link between area 1 and area 2 devices would need either to be placed in area 0 — creating a discontiguous backbone — or bridged with a virtual link. Hub-and-spoke keeps the area design clean, and §9.2 prices t</w:t>
-      </w:r>
-      <w:r>
-        <w:t>he correct redundancy solution (dual-homing each branch to two HQ routers) rather than the cheap-looking wrong one.</w:t>
+        <w:t>A partial mesh (adding BR1↔BR2) was evaluated and rejected on two grounds. First, cost: a third circuit to carry branch-to-branch traffic measured in kilobits. Second, and more interesting technically, such a link would join two non-backbone areas directly. OSPF requires every area to touch area 0; a link between area 1 and area 2 devices would need either to be placed in area 0 — creating a discontiguous backbone — or bridged with a virtual link. Hub-and-spoke keeps the area design clean, and §9.2 prices the correct redundancy solution (dual-homing each branch to two HQ routers) rather than the cheap-looking wrong one.</w:t>
       </w:r>
     </w:p>
     <w:p>
@@ -3783,7 +3741,6 @@
           <w:sz w:val="30"/>
           <w:szCs w:val="30"/>
         </w:rPr>
-        <w:lastRenderedPageBreak/>
         <w:t>4. Addressing design</w:t>
       </w:r>
       <w:bookmarkEnd w:id="12"/>
@@ -3858,12 +3815,6 @@
         <w:gridCol w:w="2431"/>
       </w:tblGrid>
       <w:tr>
-        <w:tblPrEx>
-          <w:tblCellMar>
-            <w:top w:w="0" w:type="dxa"/>
-            <w:bottom w:w="0" w:type="dxa"/>
-          </w:tblCellMar>
-        </w:tblPrEx>
         <w:trPr>
           <w:tblHeader/>
         </w:trPr>
@@ -3981,12 +3932,6 @@
         </w:tc>
       </w:tr>
       <w:tr>
-        <w:tblPrEx>
-          <w:tblCellMar>
-            <w:top w:w="0" w:type="dxa"/>
-            <w:bottom w:w="0" w:type="dxa"/>
-          </w:tblCellMar>
-        </w:tblPrEx>
         <w:tc>
           <w:tcPr>
             <w:tcW w:w="2430" w:type="dxa"/>
@@ -4086,12 +4031,6 @@
         </w:tc>
       </w:tr>
       <w:tr>
-        <w:tblPrEx>
-          <w:tblCellMar>
-            <w:top w:w="0" w:type="dxa"/>
-            <w:bottom w:w="0" w:type="dxa"/>
-          </w:tblCellMar>
-        </w:tblPrEx>
         <w:tc>
           <w:tcPr>
             <w:tcW w:w="2430" w:type="dxa"/>
@@ -4195,12 +4134,6 @@
         </w:tc>
       </w:tr>
       <w:tr>
-        <w:tblPrEx>
-          <w:tblCellMar>
-            <w:top w:w="0" w:type="dxa"/>
-            <w:bottom w:w="0" w:type="dxa"/>
-          </w:tblCellMar>
-        </w:tblPrEx>
         <w:tc>
           <w:tcPr>
             <w:tcW w:w="2430" w:type="dxa"/>
@@ -4300,12 +4233,6 @@
         </w:tc>
       </w:tr>
       <w:tr>
-        <w:tblPrEx>
-          <w:tblCellMar>
-            <w:top w:w="0" w:type="dxa"/>
-            <w:bottom w:w="0" w:type="dxa"/>
-          </w:tblCellMar>
-        </w:tblPrEx>
         <w:tc>
           <w:tcPr>
             <w:tcW w:w="2430" w:type="dxa"/>
@@ -4582,12 +4509,6 @@
         <w:gridCol w:w="1953"/>
       </w:tblGrid>
       <w:tr>
-        <w:tblPrEx>
-          <w:tblCellMar>
-            <w:top w:w="0" w:type="dxa"/>
-            <w:bottom w:w="0" w:type="dxa"/>
-          </w:tblCellMar>
-        </w:tblPrEx>
         <w:trPr>
           <w:tblHeader/>
         </w:trPr>
@@ -4705,12 +4626,6 @@
         </w:tc>
       </w:tr>
       <w:tr>
-        <w:tblPrEx>
-          <w:tblCellMar>
-            <w:top w:w="0" w:type="dxa"/>
-            <w:bottom w:w="0" w:type="dxa"/>
-          </w:tblCellMar>
-        </w:tblPrEx>
         <w:tc>
           <w:tcPr>
             <w:tcW w:w="853" w:type="dxa"/>
@@ -4818,12 +4733,6 @@
         </w:tc>
       </w:tr>
       <w:tr>
-        <w:tblPrEx>
-          <w:tblCellMar>
-            <w:top w:w="0" w:type="dxa"/>
-            <w:bottom w:w="0" w:type="dxa"/>
-          </w:tblCellMar>
-        </w:tblPrEx>
         <w:tc>
           <w:tcPr>
             <w:tcW w:w="853" w:type="dxa"/>
@@ -4935,12 +4844,6 @@
         </w:tc>
       </w:tr>
       <w:tr>
-        <w:tblPrEx>
-          <w:tblCellMar>
-            <w:top w:w="0" w:type="dxa"/>
-            <w:bottom w:w="0" w:type="dxa"/>
-          </w:tblCellMar>
-        </w:tblPrEx>
         <w:tc>
           <w:tcPr>
             <w:tcW w:w="853" w:type="dxa"/>
@@ -5114,7 +5017,6 @@
           <w:sz w:val="30"/>
           <w:szCs w:val="30"/>
         </w:rPr>
-        <w:lastRenderedPageBreak/>
         <w:t>5. Routing design</w:t>
       </w:r>
       <w:bookmarkEnd w:id="16"/>
@@ -5197,12 +5099,6 @@
         <w:gridCol w:w="5722"/>
       </w:tblGrid>
       <w:tr>
-        <w:tblPrEx>
-          <w:tblCellMar>
-            <w:top w:w="0" w:type="dxa"/>
-            <w:bottom w:w="0" w:type="dxa"/>
-          </w:tblCellMar>
-        </w:tblPrEx>
         <w:trPr>
           <w:tblHeader/>
         </w:trPr>
@@ -5292,12 +5188,6 @@
         </w:tc>
       </w:tr>
       <w:tr>
-        <w:tblPrEx>
-          <w:tblCellMar>
-            <w:top w:w="0" w:type="dxa"/>
-            <w:bottom w:w="0" w:type="dxa"/>
-          </w:tblCellMar>
-        </w:tblPrEx>
         <w:tc>
           <w:tcPr>
             <w:tcW w:w="889" w:type="dxa"/>
@@ -5372,12 +5262,6 @@
         </w:tc>
       </w:tr>
       <w:tr>
-        <w:tblPrEx>
-          <w:tblCellMar>
-            <w:top w:w="0" w:type="dxa"/>
-            <w:bottom w:w="0" w:type="dxa"/>
-          </w:tblCellMar>
-        </w:tblPrEx>
         <w:tc>
           <w:tcPr>
             <w:tcW w:w="889" w:type="dxa"/>
@@ -5455,12 +5339,6 @@
         </w:tc>
       </w:tr>
       <w:tr>
-        <w:tblPrEx>
-          <w:tblCellMar>
-            <w:top w:w="0" w:type="dxa"/>
-            <w:bottom w:w="0" w:type="dxa"/>
-          </w:tblCellMar>
-        </w:tblPrEx>
         <w:tc>
           <w:tcPr>
             <w:tcW w:w="889" w:type="dxa"/>
@@ -5546,7 +5424,10 @@
         <w:jc w:val="both"/>
       </w:pPr>
       <w:r>
-        <w:t>At 16 internal prefixes, a single area 0 would function perfectly well, and the report states that rather than overselling the area design. Areas were chosen because they scale in the direction the company is growing, because a branch link flap then triggers SPF only inside that branch area, and — concretely — because they enable summarisation at the ABR:</w:t>
+        <w:t>At 20 internal prefixes, a single area 0</w:t>
+      </w:r>
+      <w:r>
+        <w:t xml:space="preserve"> would function perfectly well, and the report states that rather than overselling the area design. Areas were chosen because they scale in the direction the company is growing, because a branch link flap then triggers SPF only inside that branch area, and — concretely — because they enable summarisation at the ABR:</w:t>
       </w:r>
     </w:p>
     <w:p>
@@ -5595,7 +5476,7 @@
           <w:b/>
           <w:bCs/>
         </w:rPr>
-        <w:t>Measured effect (test C5):</w:t>
+        <w:t>Expected effect (test C5):</w:t>
       </w:r>
     </w:p>
     <w:tbl>
@@ -5621,12 +5502,6 @@
         <w:gridCol w:w="2293"/>
       </w:tblGrid>
       <w:tr>
-        <w:tblPrEx>
-          <w:tblCellMar>
-            <w:top w:w="0" w:type="dxa"/>
-            <w:bottom w:w="0" w:type="dxa"/>
-          </w:tblCellMar>
-        </w:tblPrEx>
         <w:trPr>
           <w:tblHeader/>
         </w:trPr>
@@ -5705,12 +5580,6 @@
         </w:tc>
       </w:tr>
       <w:tr>
-        <w:tblPrEx>
-          <w:tblCellMar>
-            <w:top w:w="0" w:type="dxa"/>
-            <w:bottom w:w="0" w:type="dxa"/>
-          </w:tblCellMar>
-        </w:tblPrEx>
         <w:tc>
           <w:tcPr>
             <w:tcW w:w="4011" w:type="dxa"/>
@@ -5755,7 +5624,7 @@
                 <w:sz w:val="18"/>
                 <w:szCs w:val="18"/>
               </w:rPr>
-              <w:t>8</w:t>
+              <w:t>10</w:t>
             </w:r>
           </w:p>
         </w:tc>
@@ -5781,18 +5650,12 @@
                 <w:sz w:val="18"/>
                 <w:szCs w:val="18"/>
               </w:rPr>
-              <w:t>2</w:t>
+              <w:t>6</w:t>
             </w:r>
           </w:p>
         </w:tc>
       </w:tr>
       <w:tr>
-        <w:tblPrEx>
-          <w:tblCellMar>
-            <w:top w:w="0" w:type="dxa"/>
-            <w:bottom w:w="0" w:type="dxa"/>
-          </w:tblCellMar>
-        </w:tblPrEx>
         <w:tc>
           <w:tcPr>
             <w:tcW w:w="4011" w:type="dxa"/>
@@ -5866,7 +5729,7 @@
                 <w:sz w:val="18"/>
                 <w:szCs w:val="18"/>
               </w:rPr>
-              <w:t>75 %</w:t>
+              <w:t>40 %</w:t>
             </w:r>
           </w:p>
         </w:tc>
@@ -5883,7 +5746,10 @@
         <w:jc w:val="both"/>
       </w:pPr>
       <w:r>
-        <w:t xml:space="preserve">Beyond the count, the qualitative benefit is stability: the backbone no longer hears about an individual branch VLAN appearing or disappearing. Only loss of the entire </w:t>
+        <w:t>Each branch advertises five prefixes: three LANs, its serial /30 and its loopback /32. Only the LANs sit inside the branch /22; the /30 and /32 come from the infrastructure block 172.16.255.0/24 and are still advertised individually. Beyond the count, the qualitative benefit is stability:</w:t>
+      </w:r>
+      <w:r>
+        <w:t xml:space="preserve"> the backbone no longer hears about an individual branch VLAN appearing or disappearing. Only loss of the entire </w:t>
       </w:r>
       <w:r>
         <w:rPr>
@@ -5965,7 +5831,6 @@
         <w:jc w:val="both"/>
       </w:pPr>
       <w:r>
-        <w:lastRenderedPageBreak/>
         <w:t>The value must be identical domain-wide; a mismatch produces asymmetric routing that is genuinely difficult to diagnose. This is why it appears in all four configurations and as an explicit test case (C4).</w:t>
       </w:r>
     </w:p>
@@ -6089,10 +5954,7 @@
         <w:t>area &lt;n&gt; authentication message-digest</w:t>
       </w:r>
       <w:r>
-        <w:t xml:space="preserve"> in all three areas. This closes the cheapest full man-in-the-middle available on a routed network: an attacker with access to a link forming an adjacency and advertising a better default route. MD5 is weak as a hash by current standards — the honest claim is that this raises the bar substantially over no authentication, not that it is cryptographically strong. A current design would use OSPFv3 with IPsec; Packet Tracer does not im</w:t>
-      </w:r>
-      <w:r>
-        <w:t>plement SHA-family OSPF authentication, so MD5 is what the build can demonstrate.</w:t>
+        <w:t xml:space="preserve"> in all three areas. This closes the cheapest full man-in-the-middle available on a routed network: an attacker with access to a link forming an adjacency and advertising a better default route. MD5 is weak as a hash by current standards — the honest claim is that this raises the bar substantially over no authentication, not that it is cryptographically strong. A current design would use OSPFv3 with IPsec; Packet Tracer does not implement SHA-family OSPF authentication, so MD5 is what the build can demonstrate.</w:t>
       </w:r>
     </w:p>
     <w:p>
@@ -6117,7 +5979,6 @@
           <w:sz w:val="30"/>
           <w:szCs w:val="30"/>
         </w:rPr>
-        <w:lastRenderedPageBreak/>
         <w:t>6. Services design</w:t>
       </w:r>
       <w:bookmarkEnd w:id="22"/>
@@ -6184,12 +6045,6 @@
         <w:gridCol w:w="4591"/>
       </w:tblGrid>
       <w:tr>
-        <w:tblPrEx>
-          <w:tblCellMar>
-            <w:top w:w="0" w:type="dxa"/>
-            <w:bottom w:w="0" w:type="dxa"/>
-          </w:tblCellMar>
-        </w:tblPrEx>
         <w:trPr>
           <w:tblHeader/>
         </w:trPr>
@@ -6279,12 +6134,6 @@
         </w:tc>
       </w:tr>
       <w:tr>
-        <w:tblPrEx>
-          <w:tblCellMar>
-            <w:top w:w="0" w:type="dxa"/>
-            <w:bottom w:w="0" w:type="dxa"/>
-          </w:tblCellMar>
-        </w:tblPrEx>
         <w:tc>
           <w:tcPr>
             <w:tcW w:w="611" w:type="dxa"/>
@@ -6402,12 +6251,6 @@
         </w:tc>
       </w:tr>
       <w:tr>
-        <w:tblPrEx>
-          <w:tblCellMar>
-            <w:top w:w="0" w:type="dxa"/>
-            <w:bottom w:w="0" w:type="dxa"/>
-          </w:tblCellMar>
-        </w:tblPrEx>
         <w:tc>
           <w:tcPr>
             <w:tcW w:w="611" w:type="dxa"/>
@@ -6736,7 +6579,6 @@
           <w:sz w:val="30"/>
           <w:szCs w:val="30"/>
         </w:rPr>
-        <w:lastRenderedPageBreak/>
         <w:t>7. Security design</w:t>
       </w:r>
       <w:bookmarkEnd w:id="26"/>
@@ -6784,12 +6626,6 @@
         <w:gridCol w:w="4513"/>
       </w:tblGrid>
       <w:tr>
-        <w:tblPrEx>
-          <w:tblCellMar>
-            <w:top w:w="0" w:type="dxa"/>
-            <w:bottom w:w="0" w:type="dxa"/>
-          </w:tblCellMar>
-        </w:tblPrEx>
         <w:trPr>
           <w:tblHeader/>
         </w:trPr>
@@ -6851,12 +6687,6 @@
         </w:tc>
       </w:tr>
       <w:tr>
-        <w:tblPrEx>
-          <w:tblCellMar>
-            <w:top w:w="0" w:type="dxa"/>
-            <w:bottom w:w="0" w:type="dxa"/>
-          </w:tblCellMar>
-        </w:tblPrEx>
         <w:tc>
           <w:tcPr>
             <w:tcW w:w="4513" w:type="dxa"/>
@@ -6907,12 +6737,6 @@
         </w:tc>
       </w:tr>
       <w:tr>
-        <w:tblPrEx>
-          <w:tblCellMar>
-            <w:top w:w="0" w:type="dxa"/>
-            <w:bottom w:w="0" w:type="dxa"/>
-          </w:tblCellMar>
-        </w:tblPrEx>
         <w:tc>
           <w:tcPr>
             <w:tcW w:w="4513" w:type="dxa"/>
@@ -6965,12 +6789,6 @@
         </w:tc>
       </w:tr>
       <w:tr>
-        <w:tblPrEx>
-          <w:tblCellMar>
-            <w:top w:w="0" w:type="dxa"/>
-            <w:bottom w:w="0" w:type="dxa"/>
-          </w:tblCellMar>
-        </w:tblPrEx>
         <w:tc>
           <w:tcPr>
             <w:tcW w:w="4513" w:type="dxa"/>
@@ -7047,12 +6865,6 @@
         </w:tc>
       </w:tr>
       <w:tr>
-        <w:tblPrEx>
-          <w:tblCellMar>
-            <w:top w:w="0" w:type="dxa"/>
-            <w:bottom w:w="0" w:type="dxa"/>
-          </w:tblCellMar>
-        </w:tblPrEx>
         <w:tc>
           <w:tcPr>
             <w:tcW w:w="4513" w:type="dxa"/>
@@ -7105,12 +6917,6 @@
         </w:tc>
       </w:tr>
       <w:tr>
-        <w:tblPrEx>
-          <w:tblCellMar>
-            <w:top w:w="0" w:type="dxa"/>
-            <w:bottom w:w="0" w:type="dxa"/>
-          </w:tblCellMar>
-        </w:tblPrEx>
         <w:tc>
           <w:tcPr>
             <w:tcW w:w="4513" w:type="dxa"/>
@@ -7161,12 +6967,6 @@
         </w:tc>
       </w:tr>
       <w:tr>
-        <w:tblPrEx>
-          <w:tblCellMar>
-            <w:top w:w="0" w:type="dxa"/>
-            <w:bottom w:w="0" w:type="dxa"/>
-          </w:tblCellMar>
-        </w:tblPrEx>
         <w:tc>
           <w:tcPr>
             <w:tcW w:w="4513" w:type="dxa"/>
@@ -7219,12 +7019,6 @@
         </w:tc>
       </w:tr>
       <w:tr>
-        <w:tblPrEx>
-          <w:tblCellMar>
-            <w:top w:w="0" w:type="dxa"/>
-            <w:bottom w:w="0" w:type="dxa"/>
-          </w:tblCellMar>
-        </w:tblPrEx>
         <w:tc>
           <w:tcPr>
             <w:tcW w:w="4513" w:type="dxa"/>
@@ -7284,12 +7078,6 @@
         </w:tc>
       </w:tr>
       <w:tr>
-        <w:tblPrEx>
-          <w:tblCellMar>
-            <w:top w:w="0" w:type="dxa"/>
-            <w:bottom w:w="0" w:type="dxa"/>
-          </w:tblCellMar>
-        </w:tblPrEx>
         <w:tc>
           <w:tcPr>
             <w:tcW w:w="4513" w:type="dxa"/>
@@ -7342,12 +7130,6 @@
         </w:tc>
       </w:tr>
       <w:tr>
-        <w:tblPrEx>
-          <w:tblCellMar>
-            <w:top w:w="0" w:type="dxa"/>
-            <w:bottom w:w="0" w:type="dxa"/>
-          </w:tblCellMar>
-        </w:tblPrEx>
         <w:tc>
           <w:tcPr>
             <w:tcW w:w="4513" w:type="dxa"/>
@@ -7398,12 +7180,6 @@
         </w:tc>
       </w:tr>
       <w:tr>
-        <w:tblPrEx>
-          <w:tblCellMar>
-            <w:top w:w="0" w:type="dxa"/>
-            <w:bottom w:w="0" w:type="dxa"/>
-          </w:tblCellMar>
-        </w:tblPrEx>
         <w:tc>
           <w:tcPr>
             <w:tcW w:w="4513" w:type="dxa"/>
@@ -7491,12 +7267,6 @@
         </w:tc>
       </w:tr>
       <w:tr>
-        <w:tblPrEx>
-          <w:tblCellMar>
-            <w:top w:w="0" w:type="dxa"/>
-            <w:bottom w:w="0" w:type="dxa"/>
-          </w:tblCellMar>
-        </w:tblPrEx>
         <w:tc>
           <w:tcPr>
             <w:tcW w:w="4513" w:type="dxa"/>
@@ -7556,12 +7326,6 @@
         </w:tc>
       </w:tr>
       <w:tr>
-        <w:tblPrEx>
-          <w:tblCellMar>
-            <w:top w:w="0" w:type="dxa"/>
-            <w:bottom w:w="0" w:type="dxa"/>
-          </w:tblCellMar>
-        </w:tblPrEx>
         <w:tc>
           <w:tcPr>
             <w:tcW w:w="4513" w:type="dxa"/>
@@ -7820,7 +7584,6 @@
           <w:sz w:val="30"/>
           <w:szCs w:val="30"/>
         </w:rPr>
-        <w:lastRenderedPageBreak/>
         <w:t>8. Build plan and testing</w:t>
       </w:r>
     </w:p>
@@ -7846,10 +7609,7 @@
         <w:jc w:val="both"/>
       </w:pPr>
       <w:r>
-        <w:t>Nine devices are configured:</w:t>
-      </w:r>
-      <w:r>
-        <w:t xml:space="preserve"> four routers (one simulating the ISP), one multilayer switch, four access switches, plus three servers and end hosts. The complete configurations are in </w:t>
+        <w:t xml:space="preserve">Nine devices are configured: four routers (one simulating the ISP), one multilayer switch, four access switches, plus three servers and end hosts. The complete configurations are in </w:t>
       </w:r>
       <w:r>
         <w:rPr>
@@ -7928,12 +7688,6 @@
         <w:gridCol w:w="745"/>
       </w:tblGrid>
       <w:tr>
-        <w:tblPrEx>
-          <w:tblCellMar>
-            <w:top w:w="0" w:type="dxa"/>
-            <w:bottom w:w="0" w:type="dxa"/>
-          </w:tblCellMar>
-        </w:tblPrEx>
         <w:trPr>
           <w:tblHeader/>
         </w:trPr>
@@ -8079,12 +7833,6 @@
         </w:tc>
       </w:tr>
       <w:tr>
-        <w:tblPrEx>
-          <w:tblCellMar>
-            <w:top w:w="0" w:type="dxa"/>
-            <w:bottom w:w="0" w:type="dxa"/>
-          </w:tblCellMar>
-        </w:tblPrEx>
         <w:tc>
           <w:tcPr>
             <w:tcW w:w="743" w:type="dxa"/>
@@ -8191,12 +7939,6 @@
         </w:tc>
       </w:tr>
       <w:tr>
-        <w:tblPrEx>
-          <w:tblCellMar>
-            <w:top w:w="0" w:type="dxa"/>
-            <w:bottom w:w="0" w:type="dxa"/>
-          </w:tblCellMar>
-        </w:tblPrEx>
         <w:tc>
           <w:tcPr>
             <w:tcW w:w="743" w:type="dxa"/>
@@ -8308,12 +8050,6 @@
         </w:tc>
       </w:tr>
       <w:tr>
-        <w:tblPrEx>
-          <w:tblCellMar>
-            <w:top w:w="0" w:type="dxa"/>
-            <w:bottom w:w="0" w:type="dxa"/>
-          </w:tblCellMar>
-        </w:tblPrEx>
         <w:tc>
           <w:tcPr>
             <w:tcW w:w="743" w:type="dxa"/>
@@ -8420,12 +8156,6 @@
         </w:tc>
       </w:tr>
       <w:tr>
-        <w:tblPrEx>
-          <w:tblCellMar>
-            <w:top w:w="0" w:type="dxa"/>
-            <w:bottom w:w="0" w:type="dxa"/>
-          </w:tblCellMar>
-        </w:tblPrEx>
         <w:tc>
           <w:tcPr>
             <w:tcW w:w="743" w:type="dxa"/>
@@ -8537,12 +8267,6 @@
         </w:tc>
       </w:tr>
       <w:tr>
-        <w:tblPrEx>
-          <w:tblCellMar>
-            <w:top w:w="0" w:type="dxa"/>
-            <w:bottom w:w="0" w:type="dxa"/>
-          </w:tblCellMar>
-        </w:tblPrEx>
         <w:tc>
           <w:tcPr>
             <w:tcW w:w="743" w:type="dxa"/>
@@ -8649,12 +8373,6 @@
         </w:tc>
       </w:tr>
       <w:tr>
-        <w:tblPrEx>
-          <w:tblCellMar>
-            <w:top w:w="0" w:type="dxa"/>
-            <w:bottom w:w="0" w:type="dxa"/>
-          </w:tblCellMar>
-        </w:tblPrEx>
         <w:tc>
           <w:tcPr>
             <w:tcW w:w="743" w:type="dxa"/>
@@ -8766,12 +8484,6 @@
         </w:tc>
       </w:tr>
       <w:tr>
-        <w:tblPrEx>
-          <w:tblCellMar>
-            <w:top w:w="0" w:type="dxa"/>
-            <w:bottom w:w="0" w:type="dxa"/>
-          </w:tblCellMar>
-        </w:tblPrEx>
         <w:tc>
           <w:tcPr>
             <w:tcW w:w="743" w:type="dxa"/>
@@ -8878,12 +8590,6 @@
         </w:tc>
       </w:tr>
       <w:tr>
-        <w:tblPrEx>
-          <w:tblCellMar>
-            <w:top w:w="0" w:type="dxa"/>
-            <w:bottom w:w="0" w:type="dxa"/>
-          </w:tblCellMar>
-        </w:tblPrEx>
         <w:tc>
           <w:tcPr>
             <w:tcW w:w="743" w:type="dxa"/>
@@ -9062,7 +8768,13 @@
         <w:t>HQ-CORE</w:t>
       </w:r>
       <w:r>
-        <w:t xml:space="preserve"> shows exactly two inter-area branch routes where eight would otherwise appear — a 75 % reduction, achieved with two lines of configuration made possible by a decision taken in the </w:t>
+        <w:t xml:space="preserve"> </w:t>
+      </w:r>
+      <w:r>
+        <w:t>shows one route per branch LAN block instead of three LAN routes, six branch routes in total instead of ten (a 40 % reduction), achieved with two lines of</w:t>
+      </w:r>
+      <w:r>
+        <w:t xml:space="preserve"> configuration made possible by a decision taken in the </w:t>
       </w:r>
       <w:r>
         <w:rPr>
@@ -9119,7 +8831,6 @@
           <w:b/>
           <w:bCs/>
         </w:rPr>
-        <w:lastRenderedPageBreak/>
         <w:t>Branch autonomy survives WAN failure</w:t>
       </w:r>
       <w:r>
@@ -9214,7 +8925,6 @@
           <w:sz w:val="30"/>
           <w:szCs w:val="30"/>
         </w:rPr>
-        <w:lastRenderedPageBreak/>
         <w:t>9. Evaluation, limitations and future work</w:t>
       </w:r>
       <w:bookmarkEnd w:id="29"/>
@@ -9362,12 +9072,6 @@
         <w:gridCol w:w="2897"/>
       </w:tblGrid>
       <w:tr>
-        <w:tblPrEx>
-          <w:tblCellMar>
-            <w:top w:w="0" w:type="dxa"/>
-            <w:bottom w:w="0" w:type="dxa"/>
-          </w:tblCellMar>
-        </w:tblPrEx>
         <w:trPr>
           <w:tblHeader/>
         </w:trPr>
@@ -9485,12 +9189,6 @@
         </w:tc>
       </w:tr>
       <w:tr>
-        <w:tblPrEx>
-          <w:tblCellMar>
-            <w:top w:w="0" w:type="dxa"/>
-            <w:bottom w:w="0" w:type="dxa"/>
-          </w:tblCellMar>
-        </w:tblPrEx>
         <w:tc>
           <w:tcPr>
             <w:tcW w:w="337" w:type="dxa"/>
@@ -9651,12 +9349,6 @@
         </w:tc>
       </w:tr>
       <w:tr>
-        <w:tblPrEx>
-          <w:tblCellMar>
-            <w:top w:w="0" w:type="dxa"/>
-            <w:bottom w:w="0" w:type="dxa"/>
-          </w:tblCellMar>
-        </w:tblPrEx>
         <w:tc>
           <w:tcPr>
             <w:tcW w:w="337" w:type="dxa"/>
@@ -9768,12 +9460,6 @@
         </w:tc>
       </w:tr>
       <w:tr>
-        <w:tblPrEx>
-          <w:tblCellMar>
-            <w:top w:w="0" w:type="dxa"/>
-            <w:bottom w:w="0" w:type="dxa"/>
-          </w:tblCellMar>
-        </w:tblPrEx>
         <w:tc>
           <w:tcPr>
             <w:tcW w:w="337" w:type="dxa"/>
@@ -9872,12 +9558,6 @@
         </w:tc>
       </w:tr>
       <w:tr>
-        <w:tblPrEx>
-          <w:tblCellMar>
-            <w:top w:w="0" w:type="dxa"/>
-            <w:bottom w:w="0" w:type="dxa"/>
-          </w:tblCellMar>
-        </w:tblPrEx>
         <w:tc>
           <w:tcPr>
             <w:tcW w:w="337" w:type="dxa"/>
@@ -9980,12 +9660,6 @@
         </w:tc>
       </w:tr>
       <w:tr>
-        <w:tblPrEx>
-          <w:tblCellMar>
-            <w:top w:w="0" w:type="dxa"/>
-            <w:bottom w:w="0" w:type="dxa"/>
-          </w:tblCellMar>
-        </w:tblPrEx>
         <w:tc>
           <w:tcPr>
             <w:tcW w:w="337" w:type="dxa"/>
@@ -10111,12 +9785,6 @@
         </w:tc>
       </w:tr>
       <w:tr>
-        <w:tblPrEx>
-          <w:tblCellMar>
-            <w:top w:w="0" w:type="dxa"/>
-            <w:bottom w:w="0" w:type="dxa"/>
-          </w:tblCellMar>
-        </w:tblPrEx>
         <w:tc>
           <w:tcPr>
             <w:tcW w:w="337" w:type="dxa"/>
@@ -10259,7 +9927,6 @@
           <w:bCs/>
           <w:color w:val="2E5A88"/>
         </w:rPr>
-        <w:lastRenderedPageBreak/>
         <w:t>9.3 Reflection on the process</w:t>
       </w:r>
       <w:bookmarkEnd w:id="32"/>
@@ -10343,7 +10010,6 @@
           <w:sz w:val="30"/>
           <w:szCs w:val="30"/>
         </w:rPr>
-        <w:lastRenderedPageBreak/>
         <w:t>10. Conclusion</w:t>
       </w:r>
       <w:bookmarkEnd w:id="33"/>
@@ -10354,10 +10020,7 @@
         <w:jc w:val="both"/>
       </w:pPr>
       <w:r>
-        <w:t>A complete three-site enterprise network was designed and documented, ready to be built and verified in Packet Tracer.</w:t>
-      </w:r>
-      <w:r>
-        <w:t xml:space="preserve"> Thirteen user subnets and seven infrastructure prefixes were derived by VLSM from a single </w:t>
+        <w:t xml:space="preserve">A complete three-site enterprise network was designed and documented, ready to be built and verified in Packet Tracer. Thirteen user subnets and seven infrastructure prefixes were derived by VLSM from a single </w:t>
       </w:r>
       <w:r>
         <w:rPr>
@@ -10369,10 +10032,16 @@
         <w:t>/16</w:t>
       </w:r>
       <w:r>
-        <w:t>, structured so that each site is a single summarisable prefix. Layer-2 segmentation uses pruned 802.1Q trunks, LACP aggregation and Rapid-PVST+ with a deterministic root. OSPFv2 in three areas provides dynamic routing, and ABR summarisation reduces branch routes in the backbone by 75 %. PAT delivers Internet access for 320 users from one public address, with a single scoped static translation publishing the web s</w:t>
-      </w:r>
-      <w:r>
-        <w:t>erver. Twelve security controls were applied, each traced to a named threat, and each verified by attempting the attack it is meant to prevent rather than by reading the configuration back.</w:t>
+        <w:t xml:space="preserve">, structured so that each site is a single summarisable prefix. Layer-2 segmentation uses pruned 802.1Q trunks, LACP aggregation and Rapid-PVST+ with a deterministic root. OSPFv2 in three areas provides dynamic routing, and ABR summarisation </w:t>
+      </w:r>
+      <w:r>
+        <w:t>reduces branch routes in the backbone by 40 %.</w:t>
+      </w:r>
+      <w:r>
+        <w:t xml:space="preserve"> PAT delivers Internet access for 320 users from one public address, with a single scoped static translation publishing the web server. Twelve security controls were applied, each traced to a named threat, </w:t>
+      </w:r>
+      <w:r>
+        <w:t>and each has a test that attempts the attack it is meant to prevent rather than reading the configuration back.</w:t>
       </w:r>
     </w:p>
     <w:p>
@@ -10406,7 +10075,6 @@
           <w:sz w:val="30"/>
           <w:szCs w:val="30"/>
         </w:rPr>
-        <w:lastRenderedPageBreak/>
         <w:t>11. References</w:t>
       </w:r>
       <w:bookmarkEnd w:id="34"/>
@@ -10737,7 +10405,6 @@
           <w:sz w:val="30"/>
           <w:szCs w:val="30"/>
         </w:rPr>
-        <w:lastRenderedPageBreak/>
         <w:t>12. Appendices</w:t>
       </w:r>
       <w:bookmarkEnd w:id="35"/>
@@ -10765,12 +10432,6 @@
         <w:gridCol w:w="3784"/>
       </w:tblGrid>
       <w:tr>
-        <w:tblPrEx>
-          <w:tblCellMar>
-            <w:top w:w="0" w:type="dxa"/>
-            <w:bottom w:w="0" w:type="dxa"/>
-          </w:tblCellMar>
-        </w:tblPrEx>
         <w:trPr>
           <w:tblHeader/>
         </w:trPr>
@@ -10860,12 +10521,6 @@
         </w:tc>
       </w:tr>
       <w:tr>
-        <w:tblPrEx>
-          <w:tblCellMar>
-            <w:top w:w="0" w:type="dxa"/>
-            <w:bottom w:w="0" w:type="dxa"/>
-          </w:tblCellMar>
-        </w:tblPrEx>
         <w:tc>
           <w:tcPr>
             <w:tcW w:w="639" w:type="dxa"/>
@@ -10941,12 +10596,6 @@
         </w:tc>
       </w:tr>
       <w:tr>
-        <w:tblPrEx>
-          <w:tblCellMar>
-            <w:top w:w="0" w:type="dxa"/>
-            <w:bottom w:w="0" w:type="dxa"/>
-          </w:tblCellMar>
-        </w:tblPrEx>
         <w:tc>
           <w:tcPr>
             <w:tcW w:w="639" w:type="dxa"/>
@@ -11025,12 +10674,6 @@
         </w:tc>
       </w:tr>
       <w:tr>
-        <w:tblPrEx>
-          <w:tblCellMar>
-            <w:top w:w="0" w:type="dxa"/>
-            <w:bottom w:w="0" w:type="dxa"/>
-          </w:tblCellMar>
-        </w:tblPrEx>
         <w:tc>
           <w:tcPr>
             <w:tcW w:w="639" w:type="dxa"/>
@@ -11106,12 +10749,6 @@
         </w:tc>
       </w:tr>
       <w:tr>
-        <w:tblPrEx>
-          <w:tblCellMar>
-            <w:top w:w="0" w:type="dxa"/>
-            <w:bottom w:w="0" w:type="dxa"/>
-          </w:tblCellMar>
-        </w:tblPrEx>
         <w:tc>
           <w:tcPr>
             <w:tcW w:w="639" w:type="dxa"/>
@@ -11190,12 +10827,6 @@
         </w:tc>
       </w:tr>
       <w:tr>
-        <w:tblPrEx>
-          <w:tblCellMar>
-            <w:top w:w="0" w:type="dxa"/>
-            <w:bottom w:w="0" w:type="dxa"/>
-          </w:tblCellMar>
-        </w:tblPrEx>
         <w:tc>
           <w:tcPr>
             <w:tcW w:w="639" w:type="dxa"/>
@@ -11271,12 +10902,6 @@
         </w:tc>
       </w:tr>
       <w:tr>
-        <w:tblPrEx>
-          <w:tblCellMar>
-            <w:top w:w="0" w:type="dxa"/>
-            <w:bottom w:w="0" w:type="dxa"/>
-          </w:tblCellMar>
-        </w:tblPrEx>
         <w:tc>
           <w:tcPr>
             <w:tcW w:w="639" w:type="dxa"/>
@@ -11355,12 +10980,6 @@
         </w:tc>
       </w:tr>
       <w:tr>
-        <w:tblPrEx>
-          <w:tblCellMar>
-            <w:top w:w="0" w:type="dxa"/>
-            <w:bottom w:w="0" w:type="dxa"/>
-          </w:tblCellMar>
-        </w:tblPrEx>
         <w:tc>
           <w:tcPr>
             <w:tcW w:w="639" w:type="dxa"/>
@@ -11436,12 +11055,6 @@
         </w:tc>
       </w:tr>
       <w:tr>
-        <w:tblPrEx>
-          <w:tblCellMar>
-            <w:top w:w="0" w:type="dxa"/>
-            <w:bottom w:w="0" w:type="dxa"/>
-          </w:tblCellMar>
-        </w:tblPrEx>
         <w:tc>
           <w:tcPr>
             <w:tcW w:w="639" w:type="dxa"/>
@@ -11520,12 +11133,6 @@
         </w:tc>
       </w:tr>
       <w:tr>
-        <w:tblPrEx>
-          <w:tblCellMar>
-            <w:top w:w="0" w:type="dxa"/>
-            <w:bottom w:w="0" w:type="dxa"/>
-          </w:tblCellMar>
-        </w:tblPrEx>
         <w:tc>
           <w:tcPr>
             <w:tcW w:w="639" w:type="dxa"/>
@@ -11601,12 +11208,6 @@
         </w:tc>
       </w:tr>
       <w:tr>
-        <w:tblPrEx>
-          <w:tblCellMar>
-            <w:top w:w="0" w:type="dxa"/>
-            <w:bottom w:w="0" w:type="dxa"/>
-          </w:tblCellMar>
-        </w:tblPrEx>
         <w:tc>
           <w:tcPr>
             <w:tcW w:w="639" w:type="dxa"/>
@@ -11685,12 +11286,6 @@
         </w:tc>
       </w:tr>
       <w:tr>
-        <w:tblPrEx>
-          <w:tblCellMar>
-            <w:top w:w="0" w:type="dxa"/>
-            <w:bottom w:w="0" w:type="dxa"/>
-          </w:tblCellMar>
-        </w:tblPrEx>
         <w:tc>
           <w:tcPr>
             <w:tcW w:w="639" w:type="dxa"/>
@@ -11766,12 +11361,6 @@
         </w:tc>
       </w:tr>
       <w:tr>
-        <w:tblPrEx>
-          <w:tblCellMar>
-            <w:top w:w="0" w:type="dxa"/>
-            <w:bottom w:w="0" w:type="dxa"/>
-          </w:tblCellMar>
-        </w:tblPrEx>
         <w:tc>
           <w:tcPr>
             <w:tcW w:w="639" w:type="dxa"/>

</xml_diff>